<commit_message>
feat(p4): rebuild invoice document to match Excel sheet (2 pages + packing list)
The generated invoice was a simplified developer mock-up that didn't match
the InvoiceRU/InvoiceEN office sheets. Rebuilt in build_templates.py:
tall bordered seller/buyer boxes with the full multi-line bank requisites
(docxtpl renders the \n blocks natively), the route rows, the full 9-column
line-items table with ИТОГО, an italic pallet note, and the signature block.

Adds the page-2 Упаковочный лист / Packing List that was missing entirely:
repeats header/parties/route with a 6-column weights-only table (no prices).

Co-Authored-By: Claude Opus 4.8 (1M context) <noreply@anthropic.com>
</commit_message>
<xml_diff>
--- a/backend/apps/contracts/document_templates/invoice_en.docx
+++ b/backend/apps/contracts/document_templates/invoice_en.docx
@@ -9,7 +9,7 @@
       <w:r>
         <w:rPr>
           <w:b/>
-          <w:sz w:val="28"/>
+          <w:sz w:val="26"/>
         </w:rPr>
         <w:t>INVOICE</w:t>
       </w:r>
@@ -36,27 +36,30 @@
         <w:t>Contract № {{ contract_line }}</w:t>
       </w:r>
     </w:p>
+    <w:p/>
     <w:tbl>
       <w:tblPr>
-        <w:tblStyle w:val="TableGrid"/>
         <w:tblW w:type="auto" w:w="0"/>
+        <w:tblLayout w:type="fixed"/>
         <w:tblLook w:firstColumn="1" w:firstRow="1" w:lastColumn="0" w:lastRow="0" w:noHBand="0" w:noVBand="1" w:val="04A0"/>
       </w:tblPr>
       <w:tblGrid>
-        <w:gridCol w:w="4320"/>
-        <w:gridCol w:w="4320"/>
+        <w:gridCol w:w="3307"/>
+        <w:gridCol w:w="3307"/>
+        <w:gridCol w:w="3307"/>
       </w:tblGrid>
       <w:tr>
         <w:tc>
           <w:tcPr>
-            <w:tcW w:type="dxa" w:w="4320"/>
+            <w:tcW w:type="dxa" w:w="4535"/>
           </w:tcPr>
           <w:p>
             <w:r/>
             <w:r>
               <w:rPr>
                 <w:b/>
-                <w:sz w:val="18"/>
+                <w:i w:val="0"/>
+                <w:sz w:val="20"/>
               </w:rPr>
               <w:t>SELLER:</w:t>
             </w:r>
@@ -64,24 +67,47 @@
         </w:tc>
         <w:tc>
           <w:tcPr>
-            <w:tcW w:type="dxa" w:w="4320"/>
+            <w:tcW w:type="dxa" w:w="850"/>
+          </w:tcPr>
+          <w:p/>
+        </w:tc>
+        <w:tc>
+          <w:tcPr>
+            <w:tcW w:type="dxa" w:w="4535"/>
           </w:tcPr>
           <w:p>
             <w:r/>
             <w:r>
               <w:rPr>
                 <w:b/>
-                <w:sz w:val="18"/>
+                <w:i w:val="0"/>
+                <w:sz w:val="20"/>
               </w:rPr>
               <w:t>BUYER:</w:t>
             </w:r>
           </w:p>
         </w:tc>
       </w:tr>
+    </w:tbl>
+    <w:tbl>
+      <w:tblPr>
+        <w:tblStyle w:val="TableGrid"/>
+        <w:tblW w:type="auto" w:w="0"/>
+        <w:tblLayout w:type="fixed"/>
+        <w:tblLook w:firstColumn="1" w:firstRow="1" w:lastColumn="0" w:lastRow="0" w:noHBand="0" w:noVBand="1" w:val="04A0"/>
+      </w:tblPr>
+      <w:tblGrid>
+        <w:gridCol w:w="3307"/>
+        <w:gridCol w:w="3307"/>
+        <w:gridCol w:w="3307"/>
+      </w:tblGrid>
       <w:tr>
+        <w:trPr>
+          <w:trHeight w:val="4535" w:hRule="atLeast"/>
+        </w:trPr>
         <w:tc>
           <w:tcPr>
-            <w:tcW w:type="dxa" w:w="4320"/>
+            <w:tcW w:type="dxa" w:w="4535"/>
           </w:tcPr>
           <w:p>
             <w:r/>
@@ -93,10 +119,41 @@
               <w:t>{{ seller_name }}</w:t>
             </w:r>
           </w:p>
+          <w:p>
+            <w:r>
+              <w:rPr>
+                <w:sz w:val="18"/>
+              </w:rPr>
+              <w:t>{{ seller_address }}</w:t>
+            </w:r>
+          </w:p>
+          <w:p/>
+          <w:p/>
+          <w:p/>
+          <w:p>
+            <w:r>
+              <w:rPr>
+                <w:sz w:val="16"/>
+              </w:rPr>
+              <w:t>{{ seller_bank }}</w:t>
+            </w:r>
+          </w:p>
         </w:tc>
         <w:tc>
           <w:tcPr>
-            <w:tcW w:type="dxa" w:w="4320"/>
+            <w:tcW w:type="dxa" w:w="850"/>
+            <w:tcBorders>
+              <w:top w:val="nil"/>
+              <w:left w:val="nil"/>
+              <w:bottom w:val="nil"/>
+              <w:right w:val="nil"/>
+            </w:tcBorders>
+          </w:tcPr>
+          <w:p/>
+        </w:tc>
+        <w:tc>
+          <w:tcPr>
+            <w:tcW w:type="dxa" w:w="4535"/>
           </w:tcPr>
           <w:p>
             <w:r/>
@@ -108,65 +165,20 @@
               <w:t>{{ buyer_name }}</w:t>
             </w:r>
           </w:p>
-        </w:tc>
-      </w:tr>
-      <w:tr>
-        <w:tc>
-          <w:tcPr>
-            <w:tcW w:type="dxa" w:w="4320"/>
-          </w:tcPr>
           <w:p>
-            <w:r/>
             <w:r>
               <w:rPr>
-                <w:b w:val="0"/>
-                <w:sz w:val="18"/>
-              </w:rPr>
-              <w:t>{{ seller_address }}</w:t>
-            </w:r>
-          </w:p>
-        </w:tc>
-        <w:tc>
-          <w:tcPr>
-            <w:tcW w:type="dxa" w:w="4320"/>
-          </w:tcPr>
-          <w:p>
-            <w:r/>
-            <w:r>
-              <w:rPr>
-                <w:b w:val="0"/>
                 <w:sz w:val="18"/>
               </w:rPr>
               <w:t>{{ buyer_address }}</w:t>
             </w:r>
           </w:p>
-        </w:tc>
-      </w:tr>
-      <w:tr>
-        <w:tc>
-          <w:tcPr>
-            <w:tcW w:type="dxa" w:w="4320"/>
-          </w:tcPr>
+          <w:p/>
+          <w:p/>
+          <w:p/>
           <w:p>
-            <w:r/>
             <w:r>
               <w:rPr>
-                <w:b w:val="0"/>
-                <w:sz w:val="16"/>
-              </w:rPr>
-              <w:t>{{ seller_bank }}</w:t>
-            </w:r>
-          </w:p>
-        </w:tc>
-        <w:tc>
-          <w:tcPr>
-            <w:tcW w:type="dxa" w:w="4320"/>
-          </w:tcPr>
-          <w:p>
-            <w:r/>
-            <w:r>
-              <w:rPr>
-                <w:b w:val="0"/>
                 <w:sz w:val="16"/>
               </w:rPr>
               <w:t>{{ buyer_bank }}</w:t>
@@ -176,50 +188,154 @@
       </w:tr>
     </w:tbl>
     <w:p/>
-    <w:p>
-      <w:r>
-        <w:rPr>
-          <w:b/>
-        </w:rPr>
-        <w:t xml:space="preserve">Country of origin: </w:t>
-      </w:r>
-      <w:r>
-        <w:t>{{ country_origin }}</w:t>
-      </w:r>
-    </w:p>
-    <w:p>
-      <w:r>
-        <w:rPr>
-          <w:b/>
-        </w:rPr>
-        <w:t xml:space="preserve">Place of loading cargo: </w:t>
-      </w:r>
-      <w:r>
-        <w:t>{{ place_loading }}</w:t>
-      </w:r>
-    </w:p>
-    <w:p>
-      <w:r>
-        <w:rPr>
-          <w:b/>
-        </w:rPr>
-        <w:t xml:space="preserve">Delivery conditions: </w:t>
-      </w:r>
-      <w:r>
-        <w:t>{{ delivery_terms }}</w:t>
-      </w:r>
-    </w:p>
-    <w:p>
-      <w:r>
-        <w:rPr>
-          <w:b/>
-        </w:rPr>
-        <w:t xml:space="preserve">Type of transport (Auto): </w:t>
-      </w:r>
-      <w:r>
-        <w:t>{{ transport }}</w:t>
-      </w:r>
-    </w:p>
+    <w:tbl>
+      <w:tblPr>
+        <w:tblW w:type="auto" w:w="0"/>
+        <w:tblLayout w:type="fixed"/>
+        <w:tblLook w:firstColumn="1" w:firstRow="1" w:lastColumn="0" w:lastRow="0" w:noHBand="0" w:noVBand="1" w:val="04A0"/>
+      </w:tblPr>
+      <w:tblGrid>
+        <w:gridCol w:w="4961"/>
+        <w:gridCol w:w="4961"/>
+      </w:tblGrid>
+      <w:tr>
+        <w:tc>
+          <w:tcPr>
+            <w:tcW w:type="dxa" w:w="3402"/>
+          </w:tcPr>
+          <w:p>
+            <w:r/>
+            <w:r>
+              <w:rPr>
+                <w:b w:val="0"/>
+                <w:i w:val="0"/>
+                <w:sz w:val="20"/>
+              </w:rPr>
+              <w:t>Country of origin:</w:t>
+            </w:r>
+          </w:p>
+        </w:tc>
+        <w:tc>
+          <w:tcPr>
+            <w:tcW w:type="dxa" w:w="6520"/>
+          </w:tcPr>
+          <w:p>
+            <w:r/>
+            <w:r>
+              <w:rPr>
+                <w:b w:val="0"/>
+                <w:i w:val="0"/>
+                <w:sz w:val="20"/>
+              </w:rPr>
+              <w:t>{{ country_origin }}</w:t>
+            </w:r>
+          </w:p>
+        </w:tc>
+      </w:tr>
+      <w:tr>
+        <w:tc>
+          <w:tcPr>
+            <w:tcW w:type="dxa" w:w="3402"/>
+          </w:tcPr>
+          <w:p>
+            <w:r/>
+            <w:r>
+              <w:rPr>
+                <w:b w:val="0"/>
+                <w:i w:val="0"/>
+                <w:sz w:val="20"/>
+              </w:rPr>
+              <w:t>Place of loading cargo:</w:t>
+            </w:r>
+          </w:p>
+        </w:tc>
+        <w:tc>
+          <w:tcPr>
+            <w:tcW w:type="dxa" w:w="6520"/>
+          </w:tcPr>
+          <w:p>
+            <w:r/>
+            <w:r>
+              <w:rPr>
+                <w:b w:val="0"/>
+                <w:i w:val="0"/>
+                <w:sz w:val="20"/>
+              </w:rPr>
+              <w:t>{{ place_loading }}</w:t>
+            </w:r>
+          </w:p>
+        </w:tc>
+      </w:tr>
+      <w:tr>
+        <w:tc>
+          <w:tcPr>
+            <w:tcW w:type="dxa" w:w="3402"/>
+          </w:tcPr>
+          <w:p>
+            <w:r/>
+            <w:r>
+              <w:rPr>
+                <w:b w:val="0"/>
+                <w:i w:val="0"/>
+                <w:sz w:val="20"/>
+              </w:rPr>
+              <w:t>Delivery conditions:</w:t>
+            </w:r>
+          </w:p>
+        </w:tc>
+        <w:tc>
+          <w:tcPr>
+            <w:tcW w:type="dxa" w:w="6520"/>
+          </w:tcPr>
+          <w:p>
+            <w:r/>
+            <w:r>
+              <w:rPr>
+                <w:b w:val="0"/>
+                <w:i w:val="0"/>
+                <w:sz w:val="20"/>
+              </w:rPr>
+              <w:t>{{ delivery_terms }}</w:t>
+            </w:r>
+          </w:p>
+        </w:tc>
+      </w:tr>
+      <w:tr>
+        <w:tc>
+          <w:tcPr>
+            <w:tcW w:type="dxa" w:w="3402"/>
+          </w:tcPr>
+          <w:p>
+            <w:r/>
+            <w:r>
+              <w:rPr>
+                <w:b w:val="0"/>
+                <w:i w:val="0"/>
+                <w:sz w:val="20"/>
+              </w:rPr>
+              <w:t>Type of transport: Auto:</w:t>
+            </w:r>
+          </w:p>
+        </w:tc>
+        <w:tc>
+          <w:tcPr>
+            <w:tcW w:type="dxa" w:w="6520"/>
+          </w:tcPr>
+          <w:p>
+            <w:r/>
+            <w:r>
+              <w:rPr>
+                <w:b w:val="0"/>
+                <w:i w:val="0"/>
+                <w:sz w:val="20"/>
+              </w:rPr>
+              <w:t>{{ transport }}</w:t>
+            </w:r>
+          </w:p>
+        </w:tc>
+      </w:tr>
+    </w:tbl>
+    <w:p/>
     <w:tbl>
       <w:tblPr>
         <w:tblStyle w:val="TableGrid"/>
@@ -227,26 +343,27 @@
         <w:tblLook w:firstColumn="1" w:firstRow="1" w:lastColumn="0" w:lastRow="0" w:noHBand="0" w:noVBand="1" w:val="04A0"/>
       </w:tblPr>
       <w:tblGrid>
-        <w:gridCol w:w="960"/>
-        <w:gridCol w:w="960"/>
-        <w:gridCol w:w="960"/>
-        <w:gridCol w:w="960"/>
-        <w:gridCol w:w="960"/>
-        <w:gridCol w:w="960"/>
-        <w:gridCol w:w="960"/>
-        <w:gridCol w:w="960"/>
-        <w:gridCol w:w="960"/>
+        <w:gridCol w:w="1102"/>
+        <w:gridCol w:w="1102"/>
+        <w:gridCol w:w="1102"/>
+        <w:gridCol w:w="1102"/>
+        <w:gridCol w:w="1102"/>
+        <w:gridCol w:w="1102"/>
+        <w:gridCol w:w="1102"/>
+        <w:gridCol w:w="1102"/>
+        <w:gridCol w:w="1102"/>
       </w:tblGrid>
       <w:tr>
         <w:tc>
           <w:tcPr>
-            <w:tcW w:type="dxa" w:w="960"/>
+            <w:tcW w:type="dxa" w:w="1102"/>
           </w:tcPr>
           <w:p>
             <w:r/>
             <w:r>
               <w:rPr>
                 <w:b/>
+                <w:i w:val="0"/>
                 <w:sz w:val="16"/>
               </w:rPr>
               <w:t>№</w:t>
@@ -255,13 +372,14 @@
         </w:tc>
         <w:tc>
           <w:tcPr>
-            <w:tcW w:type="dxa" w:w="960"/>
+            <w:tcW w:type="dxa" w:w="1102"/>
           </w:tcPr>
           <w:p>
             <w:r/>
             <w:r>
               <w:rPr>
                 <w:b/>
+                <w:i w:val="0"/>
                 <w:sz w:val="16"/>
               </w:rPr>
               <w:t>Name of product</w:t>
@@ -270,28 +388,30 @@
         </w:tc>
         <w:tc>
           <w:tcPr>
-            <w:tcW w:type="dxa" w:w="960"/>
+            <w:tcW w:type="dxa" w:w="1102"/>
           </w:tcPr>
           <w:p>
             <w:r/>
             <w:r>
               <w:rPr>
                 <w:b/>
+                <w:i w:val="0"/>
                 <w:sz w:val="16"/>
               </w:rPr>
-              <w:t>Code TN FEA</w:t>
+              <w:t>Code on TN FEA</w:t>
             </w:r>
           </w:p>
         </w:tc>
         <w:tc>
           <w:tcPr>
-            <w:tcW w:type="dxa" w:w="960"/>
+            <w:tcW w:type="dxa" w:w="1102"/>
           </w:tcPr>
           <w:p>
             <w:r/>
             <w:r>
               <w:rPr>
                 <w:b/>
+                <w:i w:val="0"/>
                 <w:sz w:val="16"/>
               </w:rPr>
               <w:t>Number of pieces</w:t>
@@ -300,13 +420,14 @@
         </w:tc>
         <w:tc>
           <w:tcPr>
-            <w:tcW w:type="dxa" w:w="960"/>
+            <w:tcW w:type="dxa" w:w="1102"/>
           </w:tcPr>
           <w:p>
             <w:r/>
             <w:r>
               <w:rPr>
                 <w:b/>
+                <w:i w:val="0"/>
                 <w:sz w:val="16"/>
               </w:rPr>
               <w:t>Type of packing</w:t>
@@ -315,61 +436,65 @@
         </w:tc>
         <w:tc>
           <w:tcPr>
-            <w:tcW w:type="dxa" w:w="960"/>
+            <w:tcW w:type="dxa" w:w="1102"/>
           </w:tcPr>
           <w:p>
             <w:r/>
             <w:r>
               <w:rPr>
                 <w:b/>
+                <w:i w:val="0"/>
                 <w:sz w:val="16"/>
               </w:rPr>
-              <w:t>Gross, kg</w:t>
+              <w:t>Gross weight, kg</w:t>
             </w:r>
           </w:p>
         </w:tc>
         <w:tc>
           <w:tcPr>
-            <w:tcW w:type="dxa" w:w="960"/>
+            <w:tcW w:type="dxa" w:w="1102"/>
           </w:tcPr>
           <w:p>
             <w:r/>
             <w:r>
               <w:rPr>
                 <w:b/>
+                <w:i w:val="0"/>
                 <w:sz w:val="16"/>
               </w:rPr>
-              <w:t>Net, kg</w:t>
+              <w:t>Net weight, kg</w:t>
             </w:r>
           </w:p>
         </w:tc>
         <w:tc>
           <w:tcPr>
-            <w:tcW w:type="dxa" w:w="960"/>
+            <w:tcW w:type="dxa" w:w="1102"/>
           </w:tcPr>
           <w:p>
             <w:r/>
             <w:r>
               <w:rPr>
                 <w:b/>
+                <w:i w:val="0"/>
                 <w:sz w:val="16"/>
               </w:rPr>
-              <w:t>Price US$ per kg</w:t>
+              <w:t>Price of US dollars kg</w:t>
             </w:r>
           </w:p>
         </w:tc>
         <w:tc>
           <w:tcPr>
-            <w:tcW w:type="dxa" w:w="960"/>
+            <w:tcW w:type="dxa" w:w="1102"/>
           </w:tcPr>
           <w:p>
             <w:r/>
             <w:r>
               <w:rPr>
                 <w:b/>
+                <w:i w:val="0"/>
                 <w:sz w:val="16"/>
               </w:rPr>
-              <w:t>Total US$</w:t>
+              <w:t>Total price of US dollars</w:t>
             </w:r>
           </w:p>
         </w:tc>
@@ -377,13 +502,14 @@
       <w:tr>
         <w:tc>
           <w:tcPr>
-            <w:tcW w:type="dxa" w:w="960"/>
+            <w:tcW w:type="dxa" w:w="1102"/>
           </w:tcPr>
           <w:p>
             <w:r/>
             <w:r>
               <w:rPr>
                 <w:b w:val="0"/>
+                <w:i w:val="0"/>
                 <w:sz w:val="18"/>
               </w:rPr>
               <w:t>{{ line_items[0].n }}</w:t>
@@ -392,13 +518,14 @@
         </w:tc>
         <w:tc>
           <w:tcPr>
-            <w:tcW w:type="dxa" w:w="960"/>
+            <w:tcW w:type="dxa" w:w="1102"/>
           </w:tcPr>
           <w:p>
             <w:r/>
             <w:r>
               <w:rPr>
                 <w:b w:val="0"/>
+                <w:i w:val="0"/>
                 <w:sz w:val="18"/>
               </w:rPr>
               <w:t>{{ line_items[0].name }}</w:t>
@@ -407,13 +534,14 @@
         </w:tc>
         <w:tc>
           <w:tcPr>
-            <w:tcW w:type="dxa" w:w="960"/>
+            <w:tcW w:type="dxa" w:w="1102"/>
           </w:tcPr>
           <w:p>
             <w:r/>
             <w:r>
               <w:rPr>
                 <w:b w:val="0"/>
+                <w:i w:val="0"/>
                 <w:sz w:val="18"/>
               </w:rPr>
               <w:t>{{ line_items[0].code }}</w:t>
@@ -422,13 +550,14 @@
         </w:tc>
         <w:tc>
           <w:tcPr>
-            <w:tcW w:type="dxa" w:w="960"/>
+            <w:tcW w:type="dxa" w:w="1102"/>
           </w:tcPr>
           <w:p>
             <w:r/>
             <w:r>
               <w:rPr>
                 <w:b w:val="0"/>
+                <w:i w:val="0"/>
                 <w:sz w:val="18"/>
               </w:rPr>
               <w:t>{{ line_items[0].pieces }}</w:t>
@@ -437,13 +566,14 @@
         </w:tc>
         <w:tc>
           <w:tcPr>
-            <w:tcW w:type="dxa" w:w="960"/>
+            <w:tcW w:type="dxa" w:w="1102"/>
           </w:tcPr>
           <w:p>
             <w:r/>
             <w:r>
               <w:rPr>
                 <w:b w:val="0"/>
+                <w:i w:val="0"/>
                 <w:sz w:val="18"/>
               </w:rPr>
               <w:t>{{ line_items[0].packing }}</w:t>
@@ -452,13 +582,14 @@
         </w:tc>
         <w:tc>
           <w:tcPr>
-            <w:tcW w:type="dxa" w:w="960"/>
+            <w:tcW w:type="dxa" w:w="1102"/>
           </w:tcPr>
           <w:p>
             <w:r/>
             <w:r>
               <w:rPr>
                 <w:b w:val="0"/>
+                <w:i w:val="0"/>
                 <w:sz w:val="18"/>
               </w:rPr>
               <w:t>{{ line_items[0].gross }}</w:t>
@@ -467,13 +598,14 @@
         </w:tc>
         <w:tc>
           <w:tcPr>
-            <w:tcW w:type="dxa" w:w="960"/>
+            <w:tcW w:type="dxa" w:w="1102"/>
           </w:tcPr>
           <w:p>
             <w:r/>
             <w:r>
               <w:rPr>
                 <w:b w:val="0"/>
+                <w:i w:val="0"/>
                 <w:sz w:val="18"/>
               </w:rPr>
               <w:t>{{ line_items[0].net }}</w:t>
@@ -482,13 +614,14 @@
         </w:tc>
         <w:tc>
           <w:tcPr>
-            <w:tcW w:type="dxa" w:w="960"/>
+            <w:tcW w:type="dxa" w:w="1102"/>
           </w:tcPr>
           <w:p>
             <w:r/>
             <w:r>
               <w:rPr>
                 <w:b w:val="0"/>
+                <w:i w:val="0"/>
                 <w:sz w:val="18"/>
               </w:rPr>
               <w:t>{{ line_items[0].price }}</w:t>
@@ -497,13 +630,14 @@
         </w:tc>
         <w:tc>
           <w:tcPr>
-            <w:tcW w:type="dxa" w:w="960"/>
+            <w:tcW w:type="dxa" w:w="1102"/>
           </w:tcPr>
           <w:p>
             <w:r/>
             <w:r>
               <w:rPr>
                 <w:b w:val="0"/>
+                <w:i w:val="0"/>
                 <w:sz w:val="18"/>
               </w:rPr>
               <w:t>{{ line_items[0].total }}</w:t>
@@ -514,19 +648,20 @@
       <w:tr>
         <w:tc>
           <w:tcPr>
-            <w:tcW w:type="dxa" w:w="960"/>
+            <w:tcW w:type="dxa" w:w="1102"/>
           </w:tcPr>
           <w:p/>
         </w:tc>
         <w:tc>
           <w:tcPr>
-            <w:tcW w:type="dxa" w:w="960"/>
+            <w:tcW w:type="dxa" w:w="1102"/>
           </w:tcPr>
           <w:p>
             <w:r/>
             <w:r>
               <w:rPr>
                 <w:b/>
+                <w:i w:val="0"/>
                 <w:sz w:val="18"/>
               </w:rPr>
               <w:t>TOTAL:</w:t>
@@ -535,49 +670,50 @@
         </w:tc>
         <w:tc>
           <w:tcPr>
-            <w:tcW w:type="dxa" w:w="960"/>
+            <w:tcW w:type="dxa" w:w="1102"/>
           </w:tcPr>
           <w:p/>
         </w:tc>
         <w:tc>
           <w:tcPr>
-            <w:tcW w:type="dxa" w:w="960"/>
+            <w:tcW w:type="dxa" w:w="1102"/>
           </w:tcPr>
           <w:p/>
         </w:tc>
         <w:tc>
           <w:tcPr>
-            <w:tcW w:type="dxa" w:w="960"/>
+            <w:tcW w:type="dxa" w:w="1102"/>
           </w:tcPr>
           <w:p/>
         </w:tc>
         <w:tc>
           <w:tcPr>
-            <w:tcW w:type="dxa" w:w="960"/>
+            <w:tcW w:type="dxa" w:w="1102"/>
           </w:tcPr>
           <w:p/>
         </w:tc>
         <w:tc>
           <w:tcPr>
-            <w:tcW w:type="dxa" w:w="960"/>
+            <w:tcW w:type="dxa" w:w="1102"/>
           </w:tcPr>
           <w:p/>
         </w:tc>
         <w:tc>
           <w:tcPr>
-            <w:tcW w:type="dxa" w:w="960"/>
+            <w:tcW w:type="dxa" w:w="1102"/>
           </w:tcPr>
           <w:p/>
         </w:tc>
         <w:tc>
           <w:tcPr>
-            <w:tcW w:type="dxa" w:w="960"/>
+            <w:tcW w:type="dxa" w:w="1102"/>
           </w:tcPr>
           <w:p>
             <w:r/>
             <w:r>
               <w:rPr>
                 <w:b/>
+                <w:i w:val="0"/>
                 <w:sz w:val="18"/>
               </w:rPr>
               <w:t>{{ total_sum }}</w:t>
@@ -588,6 +724,9 @@
     </w:tbl>
     <w:p>
       <w:r>
+        <w:rPr>
+          <w:i/>
+        </w:rPr>
         <w:t>{{ pallet_note }}</w:t>
       </w:r>
     </w:p>
@@ -602,20 +741,606 @@
     </w:p>
     <w:p>
       <w:r>
-        <w:t>Goods released by: __________________ {{ seller_name }}</w:t>
+        <w:rPr>
+          <w:b/>
+        </w:rPr>
+        <w:t xml:space="preserve"> __________________{{ seller_name }}</w:t>
+      </w:r>
+    </w:p>
+    <w:p>
+      <w:r>
+        <w:rPr>
+          <w:i/>
+        </w:rPr>
+        <w:t>(signature)</w:t>
+      </w:r>
+    </w:p>
+    <w:p>
+      <w:r>
+        <w:br w:type="page"/>
       </w:r>
     </w:p>
     <w:p>
       <w:pPr>
-        <w:jc w:val="left"/>
+        <w:jc w:val="center"/>
       </w:pPr>
       <w:r>
+        <w:rPr>
+          <w:b/>
+          <w:sz w:val="26"/>
+        </w:rPr>
+        <w:t>Packing List</w:t>
+      </w:r>
+    </w:p>
+    <w:p>
+      <w:pPr>
+        <w:jc w:val="center"/>
+      </w:pPr>
+      <w:r>
+        <w:rPr>
+          <w:b/>
+        </w:rPr>
+        <w:t>№ {{ invoice_no }}, {{ invoice_date }}</w:t>
+      </w:r>
+    </w:p>
+    <w:p>
+      <w:pPr>
+        <w:jc w:val="center"/>
+      </w:pPr>
+      <w:r>
+        <w:rPr>
+          <w:b/>
+        </w:rPr>
+        <w:t>Contract № {{ contract_line }}</w:t>
+      </w:r>
+    </w:p>
+    <w:p/>
+    <w:tbl>
+      <w:tblPr>
+        <w:tblW w:type="auto" w:w="0"/>
+        <w:tblLayout w:type="fixed"/>
+        <w:tblLook w:firstColumn="1" w:firstRow="1" w:lastColumn="0" w:lastRow="0" w:noHBand="0" w:noVBand="1" w:val="04A0"/>
+      </w:tblPr>
+      <w:tblGrid>
+        <w:gridCol w:w="3307"/>
+        <w:gridCol w:w="3307"/>
+        <w:gridCol w:w="3307"/>
+      </w:tblGrid>
+      <w:tr>
+        <w:tc>
+          <w:tcPr>
+            <w:tcW w:type="dxa" w:w="4535"/>
+          </w:tcPr>
+          <w:p>
+            <w:r/>
+            <w:r>
+              <w:rPr>
+                <w:b/>
+                <w:i w:val="0"/>
+                <w:sz w:val="20"/>
+              </w:rPr>
+              <w:t>SELLER:</w:t>
+            </w:r>
+          </w:p>
+        </w:tc>
+        <w:tc>
+          <w:tcPr>
+            <w:tcW w:type="dxa" w:w="850"/>
+          </w:tcPr>
+          <w:p/>
+        </w:tc>
+        <w:tc>
+          <w:tcPr>
+            <w:tcW w:type="dxa" w:w="4535"/>
+          </w:tcPr>
+          <w:p>
+            <w:r/>
+            <w:r>
+              <w:rPr>
+                <w:b/>
+                <w:i w:val="0"/>
+                <w:sz w:val="20"/>
+              </w:rPr>
+              <w:t>BUYER:</w:t>
+            </w:r>
+          </w:p>
+        </w:tc>
+      </w:tr>
+    </w:tbl>
+    <w:tbl>
+      <w:tblPr>
+        <w:tblStyle w:val="TableGrid"/>
+        <w:tblW w:type="auto" w:w="0"/>
+        <w:tblLayout w:type="fixed"/>
+        <w:tblLook w:firstColumn="1" w:firstRow="1" w:lastColumn="0" w:lastRow="0" w:noHBand="0" w:noVBand="1" w:val="04A0"/>
+      </w:tblPr>
+      <w:tblGrid>
+        <w:gridCol w:w="3307"/>
+        <w:gridCol w:w="3307"/>
+        <w:gridCol w:w="3307"/>
+      </w:tblGrid>
+      <w:tr>
+        <w:trPr>
+          <w:trHeight w:val="4535" w:hRule="atLeast"/>
+        </w:trPr>
+        <w:tc>
+          <w:tcPr>
+            <w:tcW w:type="dxa" w:w="4535"/>
+          </w:tcPr>
+          <w:p>
+            <w:r/>
+            <w:r>
+              <w:rPr>
+                <w:b/>
+                <w:sz w:val="20"/>
+              </w:rPr>
+              <w:t>{{ seller_name }}</w:t>
+            </w:r>
+          </w:p>
+          <w:p>
+            <w:r>
+              <w:rPr>
+                <w:sz w:val="18"/>
+              </w:rPr>
+              <w:t>{{ seller_address }}</w:t>
+            </w:r>
+          </w:p>
+          <w:p/>
+          <w:p/>
+          <w:p/>
+          <w:p>
+            <w:r>
+              <w:rPr>
+                <w:sz w:val="16"/>
+              </w:rPr>
+              <w:t>{{ seller_bank }}</w:t>
+            </w:r>
+          </w:p>
+        </w:tc>
+        <w:tc>
+          <w:tcPr>
+            <w:tcW w:type="dxa" w:w="850"/>
+            <w:tcBorders>
+              <w:top w:val="nil"/>
+              <w:left w:val="nil"/>
+              <w:bottom w:val="nil"/>
+              <w:right w:val="nil"/>
+            </w:tcBorders>
+          </w:tcPr>
+          <w:p/>
+        </w:tc>
+        <w:tc>
+          <w:tcPr>
+            <w:tcW w:type="dxa" w:w="4535"/>
+          </w:tcPr>
+          <w:p>
+            <w:r/>
+            <w:r>
+              <w:rPr>
+                <w:b/>
+                <w:sz w:val="20"/>
+              </w:rPr>
+              <w:t>{{ buyer_name }}</w:t>
+            </w:r>
+          </w:p>
+          <w:p>
+            <w:r>
+              <w:rPr>
+                <w:sz w:val="18"/>
+              </w:rPr>
+              <w:t>{{ buyer_address }}</w:t>
+            </w:r>
+          </w:p>
+          <w:p/>
+          <w:p/>
+          <w:p/>
+          <w:p>
+            <w:r>
+              <w:rPr>
+                <w:sz w:val="16"/>
+              </w:rPr>
+              <w:t>{{ buyer_bank }}</w:t>
+            </w:r>
+          </w:p>
+        </w:tc>
+      </w:tr>
+    </w:tbl>
+    <w:p/>
+    <w:tbl>
+      <w:tblPr>
+        <w:tblW w:type="auto" w:w="0"/>
+        <w:tblLayout w:type="fixed"/>
+        <w:tblLook w:firstColumn="1" w:firstRow="1" w:lastColumn="0" w:lastRow="0" w:noHBand="0" w:noVBand="1" w:val="04A0"/>
+      </w:tblPr>
+      <w:tblGrid>
+        <w:gridCol w:w="4961"/>
+        <w:gridCol w:w="4961"/>
+      </w:tblGrid>
+      <w:tr>
+        <w:tc>
+          <w:tcPr>
+            <w:tcW w:type="dxa" w:w="3402"/>
+          </w:tcPr>
+          <w:p>
+            <w:r/>
+            <w:r>
+              <w:rPr>
+                <w:b w:val="0"/>
+                <w:i w:val="0"/>
+                <w:sz w:val="20"/>
+              </w:rPr>
+              <w:t>Country of origin:</w:t>
+            </w:r>
+          </w:p>
+        </w:tc>
+        <w:tc>
+          <w:tcPr>
+            <w:tcW w:type="dxa" w:w="6520"/>
+          </w:tcPr>
+          <w:p>
+            <w:r/>
+            <w:r>
+              <w:rPr>
+                <w:b w:val="0"/>
+                <w:i w:val="0"/>
+                <w:sz w:val="20"/>
+              </w:rPr>
+              <w:t>{{ country_origin }}</w:t>
+            </w:r>
+          </w:p>
+        </w:tc>
+      </w:tr>
+      <w:tr>
+        <w:tc>
+          <w:tcPr>
+            <w:tcW w:type="dxa" w:w="3402"/>
+          </w:tcPr>
+          <w:p>
+            <w:r/>
+            <w:r>
+              <w:rPr>
+                <w:b w:val="0"/>
+                <w:i w:val="0"/>
+                <w:sz w:val="20"/>
+              </w:rPr>
+              <w:t>Place of loading cargo:</w:t>
+            </w:r>
+          </w:p>
+        </w:tc>
+        <w:tc>
+          <w:tcPr>
+            <w:tcW w:type="dxa" w:w="6520"/>
+          </w:tcPr>
+          <w:p>
+            <w:r/>
+            <w:r>
+              <w:rPr>
+                <w:b w:val="0"/>
+                <w:i w:val="0"/>
+                <w:sz w:val="20"/>
+              </w:rPr>
+              <w:t>{{ place_loading }}</w:t>
+            </w:r>
+          </w:p>
+        </w:tc>
+      </w:tr>
+      <w:tr>
+        <w:tc>
+          <w:tcPr>
+            <w:tcW w:type="dxa" w:w="3402"/>
+          </w:tcPr>
+          <w:p>
+            <w:r/>
+            <w:r>
+              <w:rPr>
+                <w:b w:val="0"/>
+                <w:i w:val="0"/>
+                <w:sz w:val="20"/>
+              </w:rPr>
+              <w:t>Delivery conditions:</w:t>
+            </w:r>
+          </w:p>
+        </w:tc>
+        <w:tc>
+          <w:tcPr>
+            <w:tcW w:type="dxa" w:w="6520"/>
+          </w:tcPr>
+          <w:p>
+            <w:r/>
+            <w:r>
+              <w:rPr>
+                <w:b w:val="0"/>
+                <w:i w:val="0"/>
+                <w:sz w:val="20"/>
+              </w:rPr>
+              <w:t>{{ delivery_terms }}</w:t>
+            </w:r>
+          </w:p>
+        </w:tc>
+      </w:tr>
+      <w:tr>
+        <w:tc>
+          <w:tcPr>
+            <w:tcW w:type="dxa" w:w="3402"/>
+          </w:tcPr>
+          <w:p>
+            <w:r/>
+            <w:r>
+              <w:rPr>
+                <w:b w:val="0"/>
+                <w:i w:val="0"/>
+                <w:sz w:val="20"/>
+              </w:rPr>
+              <w:t>Type of transport: Auto:</w:t>
+            </w:r>
+          </w:p>
+        </w:tc>
+        <w:tc>
+          <w:tcPr>
+            <w:tcW w:type="dxa" w:w="6520"/>
+          </w:tcPr>
+          <w:p>
+            <w:r/>
+            <w:r>
+              <w:rPr>
+                <w:b w:val="0"/>
+                <w:i w:val="0"/>
+                <w:sz w:val="20"/>
+              </w:rPr>
+              <w:t>{{ transport }}</w:t>
+            </w:r>
+          </w:p>
+        </w:tc>
+      </w:tr>
+    </w:tbl>
+    <w:p/>
+    <w:tbl>
+      <w:tblPr>
+        <w:tblStyle w:val="TableGrid"/>
+        <w:tblW w:type="auto" w:w="0"/>
+        <w:tblLook w:firstColumn="1" w:firstRow="1" w:lastColumn="0" w:lastRow="0" w:noHBand="0" w:noVBand="1" w:val="04A0"/>
+      </w:tblPr>
+      <w:tblGrid>
+        <w:gridCol w:w="1654"/>
+        <w:gridCol w:w="1654"/>
+        <w:gridCol w:w="1654"/>
+        <w:gridCol w:w="1654"/>
+        <w:gridCol w:w="1654"/>
+        <w:gridCol w:w="1654"/>
+      </w:tblGrid>
+      <w:tr>
+        <w:tc>
+          <w:tcPr>
+            <w:tcW w:type="dxa" w:w="1654"/>
+          </w:tcPr>
+          <w:p>
+            <w:r/>
+            <w:r>
+              <w:rPr>
+                <w:b/>
+                <w:i w:val="0"/>
+                <w:sz w:val="16"/>
+              </w:rPr>
+              <w:t>№</w:t>
+            </w:r>
+          </w:p>
+        </w:tc>
+        <w:tc>
+          <w:tcPr>
+            <w:tcW w:type="dxa" w:w="1654"/>
+          </w:tcPr>
+          <w:p>
+            <w:r/>
+            <w:r>
+              <w:rPr>
+                <w:b/>
+                <w:i w:val="0"/>
+                <w:sz w:val="16"/>
+              </w:rPr>
+              <w:t>Name of product</w:t>
+            </w:r>
+          </w:p>
+        </w:tc>
+        <w:tc>
+          <w:tcPr>
+            <w:tcW w:type="dxa" w:w="1654"/>
+          </w:tcPr>
+          <w:p>
+            <w:r/>
+            <w:r>
+              <w:rPr>
+                <w:b/>
+                <w:i w:val="0"/>
+                <w:sz w:val="16"/>
+              </w:rPr>
+              <w:t>Code on TN FEA</w:t>
+            </w:r>
+          </w:p>
+        </w:tc>
+        <w:tc>
+          <w:tcPr>
+            <w:tcW w:type="dxa" w:w="1654"/>
+          </w:tcPr>
+          <w:p>
+            <w:r/>
+            <w:r>
+              <w:rPr>
+                <w:b/>
+                <w:i w:val="0"/>
+                <w:sz w:val="16"/>
+              </w:rPr>
+              <w:t>Number of pieces</w:t>
+            </w:r>
+          </w:p>
+        </w:tc>
+        <w:tc>
+          <w:tcPr>
+            <w:tcW w:type="dxa" w:w="1654"/>
+          </w:tcPr>
+          <w:p>
+            <w:r/>
+            <w:r>
+              <w:rPr>
+                <w:b/>
+                <w:i w:val="0"/>
+                <w:sz w:val="16"/>
+              </w:rPr>
+              <w:t>Gross weight, kg</w:t>
+            </w:r>
+          </w:p>
+        </w:tc>
+        <w:tc>
+          <w:tcPr>
+            <w:tcW w:type="dxa" w:w="1654"/>
+          </w:tcPr>
+          <w:p>
+            <w:r/>
+            <w:r>
+              <w:rPr>
+                <w:b/>
+                <w:i w:val="0"/>
+                <w:sz w:val="16"/>
+              </w:rPr>
+              <w:t>Net weight, kg</w:t>
+            </w:r>
+          </w:p>
+        </w:tc>
+      </w:tr>
+      <w:tr>
+        <w:tc>
+          <w:tcPr>
+            <w:tcW w:type="dxa" w:w="1654"/>
+          </w:tcPr>
+          <w:p>
+            <w:r/>
+            <w:r>
+              <w:rPr>
+                <w:b w:val="0"/>
+                <w:i w:val="0"/>
+                <w:sz w:val="18"/>
+              </w:rPr>
+              <w:t>{{ line_items[0].n }}</w:t>
+            </w:r>
+          </w:p>
+        </w:tc>
+        <w:tc>
+          <w:tcPr>
+            <w:tcW w:type="dxa" w:w="1654"/>
+          </w:tcPr>
+          <w:p>
+            <w:r/>
+            <w:r>
+              <w:rPr>
+                <w:b w:val="0"/>
+                <w:i w:val="0"/>
+                <w:sz w:val="18"/>
+              </w:rPr>
+              <w:t>{{ line_items[0].name }}</w:t>
+            </w:r>
+          </w:p>
+        </w:tc>
+        <w:tc>
+          <w:tcPr>
+            <w:tcW w:type="dxa" w:w="1654"/>
+          </w:tcPr>
+          <w:p>
+            <w:r/>
+            <w:r>
+              <w:rPr>
+                <w:b w:val="0"/>
+                <w:i w:val="0"/>
+                <w:sz w:val="18"/>
+              </w:rPr>
+              <w:t>{{ line_items[0].code }}</w:t>
+            </w:r>
+          </w:p>
+        </w:tc>
+        <w:tc>
+          <w:tcPr>
+            <w:tcW w:type="dxa" w:w="1654"/>
+          </w:tcPr>
+          <w:p>
+            <w:r/>
+            <w:r>
+              <w:rPr>
+                <w:b w:val="0"/>
+                <w:i w:val="0"/>
+                <w:sz w:val="18"/>
+              </w:rPr>
+              <w:t>{{ line_items[0].pieces }}</w:t>
+            </w:r>
+          </w:p>
+        </w:tc>
+        <w:tc>
+          <w:tcPr>
+            <w:tcW w:type="dxa" w:w="1654"/>
+          </w:tcPr>
+          <w:p>
+            <w:r/>
+            <w:r>
+              <w:rPr>
+                <w:b w:val="0"/>
+                <w:i w:val="0"/>
+                <w:sz w:val="18"/>
+              </w:rPr>
+              <w:t>{{ line_items[0].gross }}</w:t>
+            </w:r>
+          </w:p>
+        </w:tc>
+        <w:tc>
+          <w:tcPr>
+            <w:tcW w:type="dxa" w:w="1654"/>
+          </w:tcPr>
+          <w:p>
+            <w:r/>
+            <w:r>
+              <w:rPr>
+                <w:b w:val="0"/>
+                <w:i w:val="0"/>
+                <w:sz w:val="18"/>
+              </w:rPr>
+              <w:t>{{ line_items[0].net }}</w:t>
+            </w:r>
+          </w:p>
+        </w:tc>
+      </w:tr>
+    </w:tbl>
+    <w:p>
+      <w:r>
+        <w:rPr>
+          <w:i/>
+        </w:rPr>
+        <w:t>{{ pallet_note }}</w:t>
+      </w:r>
+    </w:p>
+    <w:p/>
+    <w:p>
+      <w:r>
+        <w:rPr>
+          <w:b/>
+        </w:rPr>
+        <w:t>SELLER</w:t>
+      </w:r>
+    </w:p>
+    <w:p>
+      <w:r>
+        <w:rPr>
+          <w:b/>
+        </w:rPr>
+        <w:t xml:space="preserve"> __________________{{ seller_name }}</w:t>
+      </w:r>
+    </w:p>
+    <w:p>
+      <w:r>
+        <w:rPr>
+          <w:i/>
+        </w:rPr>
         <w:t>(signature)</w:t>
       </w:r>
     </w:p>
     <w:sectPr>
-      <w:pgSz w:w="12240" w:h="15840"/>
-      <w:pgMar w:top="1440" w:right="1800" w:bottom="1440" w:left="1800" w:header="720" w:footer="720" w:gutter="0"/>
+      <w:pgSz w:w="11906" w:h="16838"/>
+      <w:pgMar w:top="850" w:right="850" w:bottom="850" w:left="1134" w:header="720" w:footer="720" w:gutter="0"/>
       <w:cols w:space="720"/>
       <w:docGrid w:linePitch="360"/>
     </w:sectPr>

</xml_diff>